<commit_message>
Add terminal and UI/UX output screenshots with technical verification section to Project Report Word document
</commit_message>
<xml_diff>
--- a/PharmaCare_Project_Report.docx
+++ b/PharmaCare_Project_Report.docx
@@ -1163,6 +1163,573 @@
         <w:t>3NF: Non-key transitive dependencies are eliminated. Physical stock items only record foreign keys (MedicineID, SupplierID), avoiding redundancy and update anomalies.</w:t>
       </w:r>
     </w:p>
+    <w:p>
+      <w:pPr>
+        <w:keepNext/>
+        <w:spacing w:before="280" w:after="80"/>
+      </w:pPr>
+      <w:r>
+        <w:rPr>
+          <w:rFonts w:ascii="Calibri" w:hAnsi="Calibri"/>
+          <w:b/>
+          <w:color w:val="0F172A"/>
+          <w:sz w:val="28"/>
+        </w:rPr>
+        <w:t>5. System Execution &amp; Output Verification</w:t>
+      </w:r>
+    </w:p>
+    <w:p>
+      <w:pPr>
+        <w:spacing w:before="40" w:after="80" w:line="276" w:lineRule="auto"/>
+      </w:pPr>
+      <w:r>
+        <w:rPr>
+          <w:rFonts w:ascii="Calibri" w:hAnsi="Calibri"/>
+          <w:color w:val="1E293B"/>
+          <w:sz w:val="19"/>
+        </w:rPr>
+        <w:t>To substantiate the system's software architecture and clinical efficacy, rigorous empirical verification was performed across both available presentation layers: the real-time desktop graphical user interface (GUI) and the standalone compiled terminal console interface (CLI). The following outputs demonstrate live execution under authentic laboratory conditions, highlighting runtime polymorphic behavior, relational data consistency, and unbypassable patient safety gates.</w:t>
+      </w:r>
+    </w:p>
+    <w:p>
+      <w:pPr>
+        <w:keepNext/>
+        <w:spacing w:before="200" w:after="60"/>
+      </w:pPr>
+      <w:r>
+        <w:rPr>
+          <w:rFonts w:ascii="Calibri" w:hAnsi="Calibri"/>
+          <w:b/>
+          <w:color w:val="059669"/>
+          <w:sz w:val="24"/>
+        </w:rPr>
+        <w:t>5.1 Real-Time Desktop UI / UX Output (C++ IPC Bridge)</w:t>
+      </w:r>
+    </w:p>
+    <w:p>
+      <w:pPr>
+        <w:spacing w:before="40" w:after="80" w:line="276" w:lineRule="auto"/>
+      </w:pPr>
+      <w:r>
+        <w:rPr>
+          <w:rFonts w:ascii="Calibri" w:hAnsi="Calibri"/>
+          <w:color w:val="1E293B"/>
+          <w:sz w:val="19"/>
+        </w:rPr>
+        <w:t>The desktop application is engineered as a modern, high-performance cockpit powered by a compiled C++ binary backend (main.exe) operating via an inter-process communication (IPC) JSON bridge. The user interface directly reflects data maintained across the three normalized database files, updating stock badges, inventory counts, and safety statuses in real time.</w:t>
+      </w:r>
+    </w:p>
+    <w:p>
+      <w:pPr>
+        <w:spacing w:before="40" w:after="80" w:line="276" w:lineRule="auto"/>
+      </w:pPr>
+      <w:r>
+        <w:rPr>
+          <w:rFonts w:ascii="Calibri" w:hAnsi="Calibri"/>
+          <w:color w:val="1E293B"/>
+          <w:sz w:val="19"/>
+        </w:rPr>
+        <w:t>Figure 2 illustrates the Medicine Catalog view. Each pharmaceutical formulation (Tablet, Syrup, Injection) is visually differentiated with dedicated category badges and clinical usage directions generated dynamically by C++ virtual functions.</w:t>
+      </w:r>
+    </w:p>
+    <w:p>
+      <w:pPr>
+        <w:keepNext/>
+        <w:spacing w:before="120" w:after="40"/>
+        <w:jc w:val="center"/>
+      </w:pPr>
+      <w:r>
+        <w:drawing>
+          <wp:inline xmlns:a="http://schemas.openxmlformats.org/drawingml/2006/main" xmlns:pic="http://schemas.openxmlformats.org/drawingml/2006/picture">
+            <wp:extent cx="5669280" cy="2826229"/>
+            <wp:docPr id="2" name="Picture 2"/>
+            <wp:cNvGraphicFramePr>
+              <a:graphicFrameLocks noChangeAspect="1"/>
+            </wp:cNvGraphicFramePr>
+            <a:graphic>
+              <a:graphicData uri="http://schemas.openxmlformats.org/drawingml/2006/picture">
+                <pic:pic>
+                  <pic:nvPicPr>
+                    <pic:cNvPr id="0" name="screenshot_ui_catalog.png"/>
+                    <pic:cNvPicPr/>
+                  </pic:nvPicPr>
+                  <pic:blipFill>
+                    <a:blip r:embed="rId10"/>
+                    <a:stretch>
+                      <a:fillRect/>
+                    </a:stretch>
+                  </pic:blipFill>
+                  <pic:spPr>
+                    <a:xfrm>
+                      <a:off x="0" y="0"/>
+                      <a:ext cx="5669280" cy="2826229"/>
+                    </a:xfrm>
+                    <a:prstGeom prst="rect"/>
+                  </pic:spPr>
+                </pic:pic>
+              </a:graphicData>
+            </a:graphic>
+          </wp:inline>
+        </w:drawing>
+      </w:r>
+    </w:p>
+    <w:p>
+      <w:pPr>
+        <w:spacing w:before="40" w:after="160"/>
+        <w:jc w:val="center"/>
+      </w:pPr>
+      <w:r>
+        <w:rPr>
+          <w:rFonts w:ascii="Calibri" w:hAnsi="Calibri"/>
+          <w:i/>
+          <w:color w:val="64748B"/>
+          <w:sz w:val="17"/>
+        </w:rPr>
+        <w:t>Figure 2: PharmaCare Medicine Catalog showcasing polymorphic dosage formulation cards (Tablets, Syrups, Injections) with clinical usage directions dynamically resolved via C++ virtual function dispatch.</w:t>
+      </w:r>
+    </w:p>
+    <w:p>
+      <w:pPr>
+        <w:spacing w:before="40" w:after="80" w:line="276" w:lineRule="auto"/>
+      </w:pPr>
+      <w:r>
+        <w:rPr>
+          <w:rFonts w:ascii="Calibri" w:hAnsi="Calibri"/>
+          <w:color w:val="1E293B"/>
+          <w:sz w:val="19"/>
+        </w:rPr>
+        <w:t>Figure 3 demonstrates the Physical Stock Ledger table. Unlike basic single-table pharmacy scripts, PharmaCare displays distinct physical batches on the shelf (e.g. STK001 through STK008) with individual batch lot numbers, supplier IDs, unit costs, and expiry dates. Notice how batch STK005 (Cough Syrup, expired 02/2025) has its action button automatically converted to 'Locked (Expired)' with a crimson status tag, preventing dispensary errors directly from the interface.</w:t>
+      </w:r>
+    </w:p>
+    <w:p>
+      <w:pPr>
+        <w:keepNext/>
+        <w:spacing w:before="120" w:after="40"/>
+        <w:jc w:val="center"/>
+      </w:pPr>
+      <w:r>
+        <w:drawing>
+          <wp:inline xmlns:a="http://schemas.openxmlformats.org/drawingml/2006/main" xmlns:pic="http://schemas.openxmlformats.org/drawingml/2006/picture">
+            <wp:extent cx="5669280" cy="2826229"/>
+            <wp:docPr id="3" name="Picture 3"/>
+            <wp:cNvGraphicFramePr>
+              <a:graphicFrameLocks noChangeAspect="1"/>
+            </wp:cNvGraphicFramePr>
+            <a:graphic>
+              <a:graphicData uri="http://schemas.openxmlformats.org/drawingml/2006/picture">
+                <pic:pic>
+                  <pic:nvPicPr>
+                    <pic:cNvPr id="0" name="screenshot_ui_stock.png"/>
+                    <pic:cNvPicPr/>
+                  </pic:nvPicPr>
+                  <pic:blipFill>
+                    <a:blip r:embed="rId11"/>
+                    <a:stretch>
+                      <a:fillRect/>
+                    </a:stretch>
+                  </pic:blipFill>
+                  <pic:spPr>
+                    <a:xfrm>
+                      <a:off x="0" y="0"/>
+                      <a:ext cx="5669280" cy="2826229"/>
+                    </a:xfrm>
+                    <a:prstGeom prst="rect"/>
+                  </pic:spPr>
+                </pic:pic>
+              </a:graphicData>
+            </a:graphic>
+          </wp:inline>
+        </w:drawing>
+      </w:r>
+    </w:p>
+    <w:p>
+      <w:pPr>
+        <w:spacing w:before="40" w:after="160"/>
+        <w:jc w:val="center"/>
+      </w:pPr>
+      <w:r>
+        <w:rPr>
+          <w:rFonts w:ascii="Calibri" w:hAnsi="Calibri"/>
+          <w:i/>
+          <w:color w:val="64748B"/>
+          <w:sz w:val="17"/>
+        </w:rPr>
+        <w:t>Figure 3: Physical Stock Ledger table displaying individual physical batches, lot numbers, supplier references, quantities, and real-time safety status badges (OK, EXPIRING SOON, EXPIRED) with active dispensary safety locks.</w:t>
+      </w:r>
+    </w:p>
+    <w:p>
+      <w:pPr>
+        <w:spacing w:before="40" w:after="80" w:line="276" w:lineRule="auto"/>
+      </w:pPr>
+      <w:r>
+        <w:rPr>
+          <w:rFonts w:ascii="Calibri" w:hAnsi="Calibri"/>
+          <w:color w:val="1E293B"/>
+          <w:sz w:val="19"/>
+        </w:rPr>
+        <w:t>Figure 4 showcases the Reports &amp; Audits module. The C++ engine computes real-time financial metrics, including total sales revenue, total procurement expenses, and net profit margins, alongside complete historical transaction records and system safety logs.</w:t>
+      </w:r>
+    </w:p>
+    <w:p>
+      <w:pPr>
+        <w:keepNext/>
+        <w:spacing w:before="120" w:after="40"/>
+        <w:jc w:val="center"/>
+      </w:pPr>
+      <w:r>
+        <w:drawing>
+          <wp:inline xmlns:a="http://schemas.openxmlformats.org/drawingml/2006/main" xmlns:pic="http://schemas.openxmlformats.org/drawingml/2006/picture">
+            <wp:extent cx="5669280" cy="2826229"/>
+            <wp:docPr id="4" name="Picture 4"/>
+            <wp:cNvGraphicFramePr>
+              <a:graphicFrameLocks noChangeAspect="1"/>
+            </wp:cNvGraphicFramePr>
+            <a:graphic>
+              <a:graphicData uri="http://schemas.openxmlformats.org/drawingml/2006/picture">
+                <pic:pic>
+                  <pic:nvPicPr>
+                    <pic:cNvPr id="0" name="screenshot_ui_reports.png"/>
+                    <pic:cNvPicPr/>
+                  </pic:nvPicPr>
+                  <pic:blipFill>
+                    <a:blip r:embed="rId12"/>
+                    <a:stretch>
+                      <a:fillRect/>
+                    </a:stretch>
+                  </pic:blipFill>
+                  <pic:spPr>
+                    <a:xfrm>
+                      <a:off x="0" y="0"/>
+                      <a:ext cx="5669280" cy="2826229"/>
+                    </a:xfrm>
+                    <a:prstGeom prst="rect"/>
+                  </pic:spPr>
+                </pic:pic>
+              </a:graphicData>
+            </a:graphic>
+          </wp:inline>
+        </w:drawing>
+      </w:r>
+    </w:p>
+    <w:p>
+      <w:pPr>
+        <w:spacing w:before="40" w:after="160"/>
+        <w:jc w:val="center"/>
+      </w:pPr>
+      <w:r>
+        <w:rPr>
+          <w:rFonts w:ascii="Calibri" w:hAnsi="Calibri"/>
+          <w:i/>
+          <w:color w:val="64748B"/>
+          <w:sz w:val="17"/>
+        </w:rPr>
+        <w:t>Figure 4: Financial &amp; Safety Audit Reports dashboard displaying total revenue, procurement expenses, transaction records, and active clinical safety alerts generated by the C++ engine.</w:t>
+      </w:r>
+    </w:p>
+    <w:p>
+      <w:pPr>
+        <w:keepNext/>
+        <w:spacing w:before="200" w:after="60"/>
+      </w:pPr>
+      <w:r>
+        <w:rPr>
+          <w:rFonts w:ascii="Calibri" w:hAnsi="Calibri"/>
+          <w:b/>
+          <w:color w:val="059669"/>
+          <w:sz w:val="24"/>
+        </w:rPr>
+        <w:t>5.2 Compiled C++ Terminal Console Execution (CLI)</w:t>
+      </w:r>
+    </w:p>
+    <w:p>
+      <w:pPr>
+        <w:spacing w:before="40" w:after="80" w:line="276" w:lineRule="auto"/>
+      </w:pPr>
+      <w:r>
+        <w:rPr>
+          <w:rFonts w:ascii="Calibri" w:hAnsi="Calibri"/>
+          <w:color w:val="1E293B"/>
+          <w:sz w:val="19"/>
+        </w:rPr>
+        <w:t>The core pharmacy engine is completely autonomous and executable in terminal environments without requiring external graphical libraries. Built with MinGW GCC under the C++11 standard, the console application provides an interactive, menu-driven interface with ANSI color formatting for maximum clarity and operator efficiency.</w:t>
+      </w:r>
+    </w:p>
+    <w:p>
+      <w:pPr>
+        <w:spacing w:before="40" w:after="80" w:line="276" w:lineRule="auto"/>
+      </w:pPr>
+      <w:r>
+        <w:rPr>
+          <w:rFonts w:ascii="Calibri" w:hAnsi="Calibri"/>
+          <w:color w:val="1E293B"/>
+          <w:sz w:val="19"/>
+        </w:rPr>
+        <w:t>Figure 5 displays the initial startup and main command menu of main.exe. During initialization, the system automatically parses and validates all three normalized database files (pharma_medicines.txt, pharma_inventory.txt, pharma_suppliers.txt), displaying real-time counts of active records in the header.</w:t>
+      </w:r>
+    </w:p>
+    <w:p>
+      <w:pPr>
+        <w:keepNext/>
+        <w:spacing w:before="120" w:after="40"/>
+        <w:jc w:val="center"/>
+      </w:pPr>
+      <w:r>
+        <w:drawing>
+          <wp:inline xmlns:a="http://schemas.openxmlformats.org/drawingml/2006/main" xmlns:pic="http://schemas.openxmlformats.org/drawingml/2006/picture">
+            <wp:extent cx="5303520" cy="4474845"/>
+            <wp:docPr id="5" name="Picture 5"/>
+            <wp:cNvGraphicFramePr>
+              <a:graphicFrameLocks noChangeAspect="1"/>
+            </wp:cNvGraphicFramePr>
+            <a:graphic>
+              <a:graphicData uri="http://schemas.openxmlformats.org/drawingml/2006/picture">
+                <pic:pic>
+                  <pic:nvPicPr>
+                    <pic:cNvPr id="0" name="screenshot_terminal_menu.png"/>
+                    <pic:cNvPicPr/>
+                  </pic:nvPicPr>
+                  <pic:blipFill>
+                    <a:blip r:embed="rId13"/>
+                    <a:stretch>
+                      <a:fillRect/>
+                    </a:stretch>
+                  </pic:blipFill>
+                  <pic:spPr>
+                    <a:xfrm>
+                      <a:off x="0" y="0"/>
+                      <a:ext cx="5303520" cy="4474845"/>
+                    </a:xfrm>
+                    <a:prstGeom prst="rect"/>
+                  </pic:spPr>
+                </pic:pic>
+              </a:graphicData>
+            </a:graphic>
+          </wp:inline>
+        </w:drawing>
+      </w:r>
+    </w:p>
+    <w:p>
+      <w:pPr>
+        <w:spacing w:before="40" w:after="160"/>
+        <w:jc w:val="center"/>
+      </w:pPr>
+      <w:r>
+        <w:rPr>
+          <w:rFonts w:ascii="Calibri" w:hAnsi="Calibri"/>
+          <w:i/>
+          <w:color w:val="64748B"/>
+          <w:sz w:val="17"/>
+        </w:rPr>
+        <w:t>Figure 5: C++ Terminal Console showing the 3-File Pharmacy Database auto-initialization sequence and the interactive numerical command menu.</w:t>
+      </w:r>
+    </w:p>
+    <w:p>
+      <w:pPr>
+        <w:spacing w:before="40" w:after="80" w:line="276" w:lineRule="auto"/>
+      </w:pPr>
+      <w:r>
+        <w:rPr>
+          <w:rFonts w:ascii="Calibri" w:hAnsi="Calibri"/>
+          <w:color w:val="1E293B"/>
+          <w:sz w:val="19"/>
+        </w:rPr>
+        <w:t>Figure 6 shows Option [1] of the console application: the Physical Stock Ledger. Batches are listed with their corresponding medicine specifications, lot numbers, current shelf quantities, and color-coded clinical status indicators.</w:t>
+      </w:r>
+    </w:p>
+    <w:p>
+      <w:pPr>
+        <w:keepNext/>
+        <w:spacing w:before="120" w:after="40"/>
+        <w:jc w:val="center"/>
+      </w:pPr>
+      <w:r>
+        <w:drawing>
+          <wp:inline xmlns:a="http://schemas.openxmlformats.org/drawingml/2006/main" xmlns:pic="http://schemas.openxmlformats.org/drawingml/2006/picture">
+            <wp:extent cx="5303520" cy="2486025"/>
+            <wp:docPr id="6" name="Picture 6"/>
+            <wp:cNvGraphicFramePr>
+              <a:graphicFrameLocks noChangeAspect="1"/>
+            </wp:cNvGraphicFramePr>
+            <a:graphic>
+              <a:graphicData uri="http://schemas.openxmlformats.org/drawingml/2006/picture">
+                <pic:pic>
+                  <pic:nvPicPr>
+                    <pic:cNvPr id="0" name="screenshot_terminal_stock.png"/>
+                    <pic:cNvPicPr/>
+                  </pic:nvPicPr>
+                  <pic:blipFill>
+                    <a:blip r:embed="rId14"/>
+                    <a:stretch>
+                      <a:fillRect/>
+                    </a:stretch>
+                  </pic:blipFill>
+                  <pic:spPr>
+                    <a:xfrm>
+                      <a:off x="0" y="0"/>
+                      <a:ext cx="5303520" cy="2486025"/>
+                    </a:xfrm>
+                    <a:prstGeom prst="rect"/>
+                  </pic:spPr>
+                </pic:pic>
+              </a:graphicData>
+            </a:graphic>
+          </wp:inline>
+        </w:drawing>
+      </w:r>
+    </w:p>
+    <w:p>
+      <w:pPr>
+        <w:spacing w:before="40" w:after="160"/>
+        <w:jc w:val="center"/>
+      </w:pPr>
+      <w:r>
+        <w:rPr>
+          <w:rFonts w:ascii="Calibri" w:hAnsi="Calibri"/>
+          <w:i/>
+          <w:color w:val="64748B"/>
+          <w:sz w:val="17"/>
+        </w:rPr>
+        <w:t>Figure 6: Tabular Physical Stock Ledger rendered directly in the terminal console with color-coded clinical status flags (OK, EXPIRING SOON, [EXPIRED - ACTION REQUIRED]).</w:t>
+      </w:r>
+    </w:p>
+    <w:p>
+      <w:pPr>
+        <w:spacing w:before="40" w:after="80" w:line="276" w:lineRule="auto"/>
+      </w:pPr>
+      <w:r>
+        <w:rPr>
+          <w:rFonts w:ascii="Calibri" w:hAnsi="Calibri"/>
+          <w:color w:val="1E293B"/>
+          <w:sz w:val="19"/>
+        </w:rPr>
+        <w:t>Figure 7 demonstrates the Patient Safety Gate in action under Option [5] (Sell / Dispense Medicine). When an operator attempts to dispense batch STK005 (expired 02/2025), the method invokes StockItem::isExpired(). Detecting an expired date, the C++ safety gate instantly aborts the transaction, prints a critical violation warning, and refuses to deduct inventory units.</w:t>
+      </w:r>
+    </w:p>
+    <w:p>
+      <w:pPr>
+        <w:keepNext/>
+        <w:spacing w:before="120" w:after="40"/>
+        <w:jc w:val="center"/>
+      </w:pPr>
+      <w:r>
+        <w:drawing>
+          <wp:inline xmlns:a="http://schemas.openxmlformats.org/drawingml/2006/main" xmlns:pic="http://schemas.openxmlformats.org/drawingml/2006/picture">
+            <wp:extent cx="5303520" cy="2707005"/>
+            <wp:docPr id="7" name="Picture 7"/>
+            <wp:cNvGraphicFramePr>
+              <a:graphicFrameLocks noChangeAspect="1"/>
+            </wp:cNvGraphicFramePr>
+            <a:graphic>
+              <a:graphicData uri="http://schemas.openxmlformats.org/drawingml/2006/picture">
+                <pic:pic>
+                  <pic:nvPicPr>
+                    <pic:cNvPr id="0" name="screenshot_terminal_safety.png"/>
+                    <pic:cNvPicPr/>
+                  </pic:nvPicPr>
+                  <pic:blipFill>
+                    <a:blip r:embed="rId15"/>
+                    <a:stretch>
+                      <a:fillRect/>
+                    </a:stretch>
+                  </pic:blipFill>
+                  <pic:spPr>
+                    <a:xfrm>
+                      <a:off x="0" y="0"/>
+                      <a:ext cx="5303520" cy="2707005"/>
+                    </a:xfrm>
+                    <a:prstGeom prst="rect"/>
+                  </pic:spPr>
+                </pic:pic>
+              </a:graphicData>
+            </a:graphic>
+          </wp:inline>
+        </w:drawing>
+      </w:r>
+    </w:p>
+    <w:p>
+      <w:pPr>
+        <w:spacing w:before="40" w:after="160"/>
+        <w:jc w:val="center"/>
+      </w:pPr>
+      <w:r>
+        <w:rPr>
+          <w:rFonts w:ascii="Calibri" w:hAnsi="Calibri"/>
+          <w:i/>
+          <w:color w:val="64748B"/>
+          <w:sz w:val="17"/>
+        </w:rPr>
+        <w:t>Figure 7: Live terminal execution proving Patient Safety Gate enforcement: an attempt to dispense expired batch STK005 is intercepted and blocked at the compiled class method level.</w:t>
+      </w:r>
+    </w:p>
+    <w:p>
+      <w:pPr>
+        <w:spacing w:before="40" w:after="80" w:line="276" w:lineRule="auto"/>
+      </w:pPr>
+      <w:r>
+        <w:rPr>
+          <w:rFonts w:ascii="Calibri" w:hAnsi="Calibri"/>
+          <w:color w:val="1E293B"/>
+          <w:sz w:val="19"/>
+        </w:rPr>
+        <w:t>Figure 8 showcases Option [11]: Polymorphic Safety Audit &amp; Alerts. The inventory engine iterates over polymorphic Alert* pointers (ExpiryAlert and LowStockAlert) stored in a heterogeneous collection, invokes their overridden display() and serialize() methods, and exports the complete audit trail to pharma_alerts.txt.</w:t>
+      </w:r>
+    </w:p>
+    <w:p>
+      <w:pPr>
+        <w:keepNext/>
+        <w:spacing w:before="120" w:after="40"/>
+        <w:jc w:val="center"/>
+      </w:pPr>
+      <w:r>
+        <w:drawing>
+          <wp:inline xmlns:a="http://schemas.openxmlformats.org/drawingml/2006/main" xmlns:pic="http://schemas.openxmlformats.org/drawingml/2006/picture">
+            <wp:extent cx="5303520" cy="3480435"/>
+            <wp:docPr id="8" name="Picture 8"/>
+            <wp:cNvGraphicFramePr>
+              <a:graphicFrameLocks noChangeAspect="1"/>
+            </wp:cNvGraphicFramePr>
+            <a:graphic>
+              <a:graphicData uri="http://schemas.openxmlformats.org/drawingml/2006/picture">
+                <pic:pic>
+                  <pic:nvPicPr>
+                    <pic:cNvPr id="0" name="screenshot_terminal_alerts.png"/>
+                    <pic:cNvPicPr/>
+                  </pic:nvPicPr>
+                  <pic:blipFill>
+                    <a:blip r:embed="rId16"/>
+                    <a:stretch>
+                      <a:fillRect/>
+                    </a:stretch>
+                  </pic:blipFill>
+                  <pic:spPr>
+                    <a:xfrm>
+                      <a:off x="0" y="0"/>
+                      <a:ext cx="5303520" cy="3480435"/>
+                    </a:xfrm>
+                    <a:prstGeom prst="rect"/>
+                  </pic:spPr>
+                </pic:pic>
+              </a:graphicData>
+            </a:graphic>
+          </wp:inline>
+        </w:drawing>
+      </w:r>
+    </w:p>
+    <w:p>
+      <w:pPr>
+        <w:spacing w:before="40" w:after="160"/>
+        <w:jc w:val="center"/>
+      </w:pPr>
+      <w:r>
+        <w:rPr>
+          <w:rFonts w:ascii="Calibri" w:hAnsi="Calibri"/>
+          <w:i/>
+          <w:color w:val="64748B"/>
+          <w:sz w:val="17"/>
+        </w:rPr>
+        <w:t>Figure 8: Polymorphic safety alert generation iterating over heterogeneous Alert* pointers (ExpiryAlert, LowStockAlert) and serializing audit logs to pharma_alerts.txt.</w:t>
+      </w:r>
+    </w:p>
     <w:sectPr>
       <w:pgSz w:w="12240" w:h="15840"/>
       <w:pgMar w:top="1440" w:right="1440" w:bottom="1440" w:left="1440" w:header="720" w:footer="720" w:gutter="0"/>

</xml_diff>